<commit_message>
refactor: simplify document footer layout and include generated project report files
</commit_message>
<xml_diff>
--- a/Final_Year_Project_Report.docx
+++ b/Final_Year_Project_Report.docx
@@ -28816,79 +28816,17 @@
   <w:p>
     <w:pPr>
       <w:pStyle w:val="Footer"/>
+      <w:jc w:val="center"/>
     </w:pPr>
+    <w:r>
+      <w:rPr>
+        <w:rFonts w:ascii="Times New Roman" w:hAnsi="Times New Roman"/>
+        <w:color w:val="808080"/>
+        <w:sz w:val="16"/>
+      </w:rPr>
+      <w:t>Department of Computer Science Engineering  |  Sri Shakthi Institute of Engineering and Technology, Coimbatore - 641 062  |  Page #</w:t>
+    </w:r>
   </w:p>
-  <w:tbl>
-    <w:tblPr>
-      <w:tblW w:type="auto" w:w="0"/>
-      <w:tblLook w:firstColumn="1" w:firstRow="1" w:lastColumn="0" w:lastRow="0" w:noHBand="0" w:noVBand="1" w:val="04A0"/>
-    </w:tblPr>
-    <w:tblGrid>
-      <w:gridCol w:w="3600"/>
-      <w:gridCol w:w="3600"/>
-      <w:gridCol w:w="2160"/>
-    </w:tblGrid>
-    <w:tr>
-      <w:tc>
-        <w:tcPr>
-          <w:tcW w:type="dxa" w:w="3120"/>
-          <w:vAlign w:val="center"/>
-        </w:tcPr>
-        <w:p>
-          <w:pPr>
-            <w:spacing w:before="0" w:after="0"/>
-            <w:jc w:val="left"/>
-          </w:pPr>
-          <w:r>
-            <w:rPr>
-              <w:rFonts w:ascii="Times New Roman" w:hAnsi="Times New Roman"/>
-              <w:sz w:val="16"/>
-            </w:rPr>
-            <w:t>Department of Computer Science Engineering</w:t>
-          </w:r>
-        </w:p>
-      </w:tc>
-      <w:tc>
-        <w:tcPr>
-          <w:tcW w:type="dxa" w:w="3120"/>
-          <w:vAlign w:val="center"/>
-        </w:tcPr>
-        <w:p>
-          <w:pPr>
-            <w:spacing w:before="0" w:after="0"/>
-            <w:jc w:val="center"/>
-          </w:pPr>
-          <w:r>
-            <w:rPr>
-              <w:rFonts w:ascii="Times New Roman" w:hAnsi="Times New Roman"/>
-              <w:sz w:val="16"/>
-            </w:rPr>
-            <w:t>Sri Shakthi Institute of Engineering and Technology</w:t>
-            <w:br/>
-            <w:t>Coimbatore - 641 062</w:t>
-          </w:r>
-        </w:p>
-      </w:tc>
-      <w:tc>
-        <w:tcPr>
-          <w:tcW w:type="dxa" w:w="3120"/>
-          <w:vAlign w:val="center"/>
-        </w:tcPr>
-        <w:p>
-          <w:pPr>
-            <w:spacing w:before="0" w:after="0"/>
-            <w:jc w:val="right"/>
-          </w:pPr>
-          <w:r>
-            <w:t xml:space="preserve">Page </w:t>
-          </w:r>
-          <w:fldChar w:fldCharType="begin"/>
-          <w:instrText xml:space="preserve"> PAGE </w:instrText>
-          <w:fldChar w:fldCharType="end"/>
-        </w:p>
-      </w:tc>
-    </w:tr>
-  </w:tbl>
 </w:ftr>
 </file>
 

</xml_diff>